<commit_message>
feat: allow versioned unreviewed edits and repeated student attempts
</commit_message>
<xml_diff>
--- a/docs/usage/downloads/Dexam-application-handbook.docx
+++ b/docs/usage/downloads/Dexam-application-handbook.docx
@@ -20,7 +20,7 @@
     </w:p>
     <w:p>
       <w:r>
-        <w:t>Edition 17 October 2026</w:t>
+        <w:t>Edition 18 October 2026</w:t>
       </w:r>
     </w:p>
     <w:p>
@@ -101,7 +101,7 @@
     </w:p>
     <w:p>
       <w:r>
-        <w:t>Version: 2026-10-17. Audience: product owner, students, teachers, operational staff and administrators. This guide describes the implemented application, not a promise that it is ready for real students.</w:t>
+        <w:t>Version: 2026-10-18. Audience: product owner, students, teachers, operational staff and administrators. This guide describes the implemented application, not a promise that it is ready for real students.</w:t>
       </w:r>
     </w:p>
     <w:p>
@@ -1538,7 +1538,7 @@
         <w:t>Submit assignment</w:t>
       </w:r>
       <w:r>
-        <w:t>. Submission permanently locks that attempt. Uploading alone is not submission.</w:t>
+        <w:t>. Uploading alone is not submission. The attempt becomes available for teacher review; it remains editable until feedback is published.</w:t>
       </w:r>
     </w:p>
     <w:p>
@@ -1551,7 +1551,30 @@
     </w:p>
     <w:p>
       <w:r>
-        <w:t>Submitted files cannot be replaced in that attempt. If a teacher requests correction, follow the request and start a new revision attempt through the existing assignment; do not create a new account or treat the old submission as editable.</w:t>
+        <w:t xml:space="preserve">Before published feedback, choose </w:t>
+      </w:r>
+      <w:r>
+        <w:rPr>
+          <w:b/>
+        </w:rPr>
+        <w:t>Edit attempt 1</w:t>
+      </w:r>
+      <w:r>
+        <w:t xml:space="preserve"> (or the relevant number) to reopen that attempt as a draft. Existing files are carried forward; add/remove files and deliberately submit again. The displayed attempt number stays the same and its version increases. The prior submitted snapshot and any private teacher draft are preserved internally. While editing, the new version is not available for review; stale feedback cannot be published against the old version.</w:t>
+      </w:r>
+    </w:p>
+    <w:p>
+      <w:r>
+        <w:t xml:space="preserve">Once feedback is published, that reviewed attempt stays locked, including a correction-request outcome. Use </w:t>
+      </w:r>
+      <w:r>
+        <w:rPr>
+          <w:b/>
+        </w:rPr>
+        <w:t>Start another attempt</w:t>
+      </w:r>
+      <w:r>
+        <w:t xml:space="preserve"> to create Attempt 2, Attempt 3 and so on. You do not need a correction request, but current course access and an active assignment release are required. Only one draft per assignment is allowed; finish it before editing another attempt. Existing file limits remain, and repeated attempts do not promise unlimited storage.</w:t>
       </w:r>
     </w:p>
     <w:p>
@@ -1802,7 +1825,7 @@
     </w:p>
     <w:p>
       <w:r>
-        <w:t>Tell the assigned teacher; submitted attempts are immutable, and a revision requires the appropriate correction workflow.</w:t>
+        <w:t>Use Edit attempt before published feedback. If reviewed, keep it locked and start another attempt while access remains active.</w:t>
       </w:r>
     </w:p>
     <w:p>
@@ -1896,7 +1919,7 @@
         <w:t>Feedback review</w:t>
       </w:r>
       <w:r>
-        <w:t>. Confirm the student, assignment, attempt and submitted files.</w:t>
+        <w:t>. Confirm the student, assignment, attempt number, version and submitted files. Multiple attempts may await review separately.</w:t>
       </w:r>
     </w:p>
     <w:p>
@@ -1947,6 +1970,29 @@
       </w:r>
       <w:r>
         <w:t xml:space="preserve"> when you are not ready to publish. Saved private feedback is not a student-visible result.</w:t>
+      </w:r>
+    </w:p>
+    <w:p>
+      <w:r>
+        <w:t xml:space="preserve">Students can edit until feedback is published. An edit creates a new version and makes the old draft ineligible for publication, without deleting it. Reload the queue, inspect the current files and confirm </w:t>
+      </w:r>
+      <w:r>
+        <w:rPr>
+          <w:b/>
+        </w:rPr>
+        <w:t>I have reviewed the updated files for this version</w:t>
+      </w:r>
+      <w:r>
+        <w:t xml:space="preserve"> before preparing feedback on an edited version. </w:t>
+      </w:r>
+      <w:r>
+        <w:rPr>
+          <w:b/>
+        </w:rPr>
+        <w:t>Previous version draft  -  reference only</w:t>
+      </w:r>
+      <w:r>
+        <w:t>, where available, shows the immediately preceding private writing; it is not silently copied or published. If publication reports changed work, do not retry the old draft blindly. Published feedback locks that exact attempt. Students may still submit a separate numbered attempt while eligible; reviewing an older attempt does not replace the newer attempt's assignment status.</w:t>
       </w:r>
     </w:p>
     <w:p>

</xml_diff>

<commit_message>
feat: allow versioned unreviewed edits and repeated student attempts (#83)
Co-authored-by: jehar-tau <jehar-tau@users.noreply.github.com>
</commit_message>
<xml_diff>
--- a/docs/usage/downloads/Dexam-application-handbook.docx
+++ b/docs/usage/downloads/Dexam-application-handbook.docx
@@ -20,7 +20,7 @@
     </w:p>
     <w:p>
       <w:r>
-        <w:t>Edition 17 October 2026</w:t>
+        <w:t>Edition 18 October 2026</w:t>
       </w:r>
     </w:p>
     <w:p>
@@ -101,7 +101,7 @@
     </w:p>
     <w:p>
       <w:r>
-        <w:t>Version: 2026-10-17. Audience: product owner, students, teachers, operational staff and administrators. This guide describes the implemented application, not a promise that it is ready for real students.</w:t>
+        <w:t>Version: 2026-10-18. Audience: product owner, students, teachers, operational staff and administrators. This guide describes the implemented application, not a promise that it is ready for real students.</w:t>
       </w:r>
     </w:p>
     <w:p>
@@ -1538,7 +1538,7 @@
         <w:t>Submit assignment</w:t>
       </w:r>
       <w:r>
-        <w:t>. Submission permanently locks that attempt. Uploading alone is not submission.</w:t>
+        <w:t>. Uploading alone is not submission. The attempt becomes available for teacher review; it remains editable until feedback is published.</w:t>
       </w:r>
     </w:p>
     <w:p>
@@ -1551,7 +1551,30 @@
     </w:p>
     <w:p>
       <w:r>
-        <w:t>Submitted files cannot be replaced in that attempt. If a teacher requests correction, follow the request and start a new revision attempt through the existing assignment; do not create a new account or treat the old submission as editable.</w:t>
+        <w:t xml:space="preserve">Before published feedback, choose </w:t>
+      </w:r>
+      <w:r>
+        <w:rPr>
+          <w:b/>
+        </w:rPr>
+        <w:t>Edit attempt 1</w:t>
+      </w:r>
+      <w:r>
+        <w:t xml:space="preserve"> (or the relevant number) to reopen that attempt as a draft. Existing files are carried forward; add/remove files and deliberately submit again. The displayed attempt number stays the same and its version increases. The prior submitted snapshot and any private teacher draft are preserved internally. While editing, the new version is not available for review; stale feedback cannot be published against the old version.</w:t>
+      </w:r>
+    </w:p>
+    <w:p>
+      <w:r>
+        <w:t xml:space="preserve">Once feedback is published, that reviewed attempt stays locked, including a correction-request outcome. Use </w:t>
+      </w:r>
+      <w:r>
+        <w:rPr>
+          <w:b/>
+        </w:rPr>
+        <w:t>Start another attempt</w:t>
+      </w:r>
+      <w:r>
+        <w:t xml:space="preserve"> to create Attempt 2, Attempt 3 and so on. You do not need a correction request, but current course access and an active assignment release are required. Only one draft per assignment is allowed; finish it before editing another attempt. Existing file limits remain, and repeated attempts do not promise unlimited storage.</w:t>
       </w:r>
     </w:p>
     <w:p>
@@ -1802,7 +1825,7 @@
     </w:p>
     <w:p>
       <w:r>
-        <w:t>Tell the assigned teacher; submitted attempts are immutable, and a revision requires the appropriate correction workflow.</w:t>
+        <w:t>Use Edit attempt before published feedback. If reviewed, keep it locked and start another attempt while access remains active.</w:t>
       </w:r>
     </w:p>
     <w:p>
@@ -1896,7 +1919,7 @@
         <w:t>Feedback review</w:t>
       </w:r>
       <w:r>
-        <w:t>. Confirm the student, assignment, attempt and submitted files.</w:t>
+        <w:t>. Confirm the student, assignment, attempt number, version and submitted files. Multiple attempts may await review separately.</w:t>
       </w:r>
     </w:p>
     <w:p>
@@ -1947,6 +1970,29 @@
       </w:r>
       <w:r>
         <w:t xml:space="preserve"> when you are not ready to publish. Saved private feedback is not a student-visible result.</w:t>
+      </w:r>
+    </w:p>
+    <w:p>
+      <w:r>
+        <w:t xml:space="preserve">Students can edit until feedback is published. An edit creates a new version and makes the old draft ineligible for publication, without deleting it. Reload the queue, inspect the current files and confirm </w:t>
+      </w:r>
+      <w:r>
+        <w:rPr>
+          <w:b/>
+        </w:rPr>
+        <w:t>I have reviewed the updated files for this version</w:t>
+      </w:r>
+      <w:r>
+        <w:t xml:space="preserve"> before preparing feedback on an edited version. </w:t>
+      </w:r>
+      <w:r>
+        <w:rPr>
+          <w:b/>
+        </w:rPr>
+        <w:t>Previous version draft  -  reference only</w:t>
+      </w:r>
+      <w:r>
+        <w:t>, where available, shows the immediately preceding private writing; it is not silently copied or published. If publication reports changed work, do not retry the old draft blindly. Published feedback locks that exact attempt. Students may still submit a separate numbered attempt while eligible; reviewing an older attempt does not replace the newer attempt's assignment status.</w:t>
       </w:r>
     </w:p>
     <w:p>

</xml_diff>

<commit_message>
feat: add scoped teacher content tools and named references
</commit_message>
<xml_diff>
--- a/docs/usage/downloads/Dexam-application-handbook.docx
+++ b/docs/usage/downloads/Dexam-application-handbook.docx
@@ -143,7 +143,7 @@
         </w:r>
       </w:hyperlink>
       <w:r>
-        <w:t>: reviewing submitted work, written/audio feedback, correction requests and assistance limits.</w:t>
+        <w:t>: scoped content authoring, named attachments, draft-topic removal, submission reviews and feedback.</w:t>
       </w:r>
     </w:p>
     <w:p>
@@ -318,18 +318,12 @@
         <w:t>/teacher</w:t>
       </w:r>
       <w:r>
-        <w:t xml:space="preserve">, </w:t>
-      </w:r>
-      <w:r>
-        <w:t>/teacher/reviews</w:t>
-      </w:r>
-      <w:r>
-        <w:t>, permitted notifications/security</w:t>
-      </w:r>
-    </w:p>
-    <w:p>
-      <w:r>
-        <w:t>Separate visual application?: Compact review rail</w:t>
+        <w:t>, authorized Reviews/Content, notifications/security</w:t>
+      </w:r>
+    </w:p>
+    <w:p>
+      <w:r>
+        <w:t>Separate visual application?: Compact teaching rail</w:t>
       </w:r>
     </w:p>
     <w:p>
@@ -718,7 +712,7 @@
     </w:p>
     <w:p>
       <w:r>
-        <w:t>Credentials / requirement: Established employee identity; current review scope checked on workspace entry</w:t>
+        <w:t>Credentials / requirement: Established employee identity; review scope or explicit same-course Teacher/content authority checked on entry</w:t>
       </w:r>
     </w:p>
     <w:p>
@@ -1316,6 +1310,20 @@
       </w:r>
     </w:p>
     <w:p>
+      <w:r>
+        <w:t xml:space="preserve">Assignments may include named reference files supplied by your teacher. Read the instructions, then use </w:t>
+      </w:r>
+      <w:r>
+        <w:rPr>
+          <w:b/>
+        </w:rPr>
+        <w:t>Assignment reference files</w:t>
+      </w:r>
+      <w:r>
+        <w:t xml:space="preserve"> to download each relevant reference. Names explain the file's purpose; these are separate from your own submission uploads. Downloads require current assignment access.</w:t>
+      </w:r>
+    </w:p>
+    <w:p>
       <w:pPr>
         <w:pStyle w:val="Heading2"/>
       </w:pPr>
@@ -1863,7 +1871,7 @@
         <w:t>/teacher</w:t>
       </w:r>
       <w:r>
-        <w:t>, with a review-focused layout. This is the same identity, not a new teacher account. Teacher access uses specifically assigned review authority - not automatic CRM, administration, content-editing, scheduling or full curriculum-reading access.</w:t>
+        <w:t>. This is the same identity, not a new teacher account. Review authority and content authoring/publication are separately scoped; Teacher alone grants neither content editing nor publishing, CRM, administration or scheduling.</w:t>
       </w:r>
     </w:p>
     <w:p>
@@ -1883,13 +1891,34 @@
         <w:t>/teacher/reviews</w:t>
       </w:r>
       <w:r>
-        <w:t xml:space="preserve">) from the teacher menu. Existing </w:t>
+        <w:t xml:space="preserve">) for assigned reviews or </w:t>
+      </w:r>
+      <w:r>
+        <w:rPr>
+          <w:b/>
+        </w:rPr>
+        <w:t>Content</w:t>
+      </w:r>
+      <w:r>
+        <w:t xml:space="preserve"> (</w:t>
+      </w:r>
+      <w:r>
+        <w:t>/teacher/content</w:t>
+      </w:r>
+      <w:r>
+        <w:t xml:space="preserve">) when explicitly authorized for academic authoring/publication. A scoped teacher author can enter without a review grant, but cannot use Reviews. Existing </w:t>
       </w:r>
       <w:r>
         <w:t>/staff/reviews</w:t>
       </w:r>
       <w:r>
-        <w:t xml:space="preserve"> bookmarks/notification links still work with the teacher layout and original guards. Without current review scope, the new teacher workspace is denied - not granted extra authority. Eligible portal-switch links change the workspace, not the signed-in person.</w:t>
+        <w:t xml:space="preserve"> and </w:t>
+      </w:r>
+      <w:r>
+        <w:t>/staff/content</w:t>
+      </w:r>
+      <w:r>
+        <w:t xml:space="preserve"> bookmarks retain their operation checks. Eligible portal-switch links change the workspace, not the signed-in person.</w:t>
       </w:r>
     </w:p>
     <w:p>
@@ -1902,7 +1931,155 @@
         <w:pStyle w:val="Heading2"/>
       </w:pPr>
       <w:r>
-        <w:t>Review a submission</w:t>
+        <w:t>Prepare topics and assignments</w:t>
+      </w:r>
+    </w:p>
+    <w:p>
+      <w:pPr>
+        <w:ind w:left="317" w:hanging="317"/>
+      </w:pPr>
+      <w:r>
+        <w:t xml:space="preserve">1. Open </w:t>
+      </w:r>
+      <w:r>
+        <w:rPr>
+          <w:b/>
+        </w:rPr>
+        <w:t>Content</w:t>
+      </w:r>
+      <w:r>
+        <w:t xml:space="preserve"> and choose your authorized </w:t>
+      </w:r>
+      <w:r>
+        <w:rPr>
+          <w:b/>
+        </w:rPr>
+        <w:t>Course offering</w:t>
+      </w:r>
+      <w:r>
+        <w:t>. Editing and publishing are separate permissions; a course assignment alone does not grant either.</w:t>
+      </w:r>
+    </w:p>
+    <w:p>
+      <w:pPr>
+        <w:ind w:left="317" w:hanging="317"/>
+      </w:pPr>
+      <w:r>
+        <w:t xml:space="preserve">2. Edit topic introductions and lesson instructions in a draft. Choose </w:t>
+      </w:r>
+      <w:r>
+        <w:rPr>
+          <w:b/>
+        </w:rPr>
+        <w:t>Attach lesson files</w:t>
+      </w:r>
+      <w:r>
+        <w:t xml:space="preserve"> to select several PDF/JPEG/PNG/WebP references. For topic-only references, choose </w:t>
+      </w:r>
+      <w:r>
+        <w:rPr>
+          <w:b/>
+        </w:rPr>
+        <w:t>Add topic attachments</w:t>
+      </w:r>
+      <w:r>
+        <w:t xml:space="preserve"> to prepare the topic's material lesson. Each lesson supports five files, 10 MB each.</w:t>
+      </w:r>
+    </w:p>
+    <w:p>
+      <w:pPr>
+        <w:ind w:left="317" w:hanging="317"/>
+      </w:pPr>
+      <w:r>
+        <w:t xml:space="preserve">3. Give each attached file a descriptive </w:t>
+      </w:r>
+      <w:r>
+        <w:rPr>
+          <w:b/>
+        </w:rPr>
+        <w:t>Attachment name</w:t>
+      </w:r>
+      <w:r>
+        <w:t xml:space="preserve">, then choose </w:t>
+      </w:r>
+      <w:r>
+        <w:rPr>
+          <w:b/>
+        </w:rPr>
+        <w:t>Save attachment name</w:t>
+      </w:r>
+      <w:r>
+        <w:t xml:space="preserve">. The original filename remains visible. In the Assignments tab, use </w:t>
+      </w:r>
+      <w:r>
+        <w:rPr>
+          <w:b/>
+        </w:rPr>
+        <w:t>Add private file</w:t>
+      </w:r>
+      <w:r>
+        <w:t xml:space="preserve"> for multiple assignment references under the same five-file/10 MB limits and name them individually.</w:t>
+      </w:r>
+    </w:p>
+    <w:p>
+      <w:pPr>
+        <w:ind w:left="317" w:hanging="317"/>
+      </w:pPr>
+      <w:r>
+        <w:t xml:space="preserve">4. To remove a draft topic, choose </w:t>
+      </w:r>
+      <w:r>
+        <w:rPr>
+          <w:b/>
+        </w:rPr>
+        <w:t>Preview topic removal</w:t>
+      </w:r>
+      <w:r>
+        <w:t>, inspect the affected lesson/file counts and linked assignments, then confirm. Explicitly unlink draft assignments first if appropriate; this preserves those assignment drafts. Published links block removal. Published topics cannot be deleted in place: create a new curriculum draft. Shared published files and earlier student versions remain protected.</w:t>
+      </w:r>
+    </w:p>
+    <w:p>
+      <w:pPr>
+        <w:ind w:left="317" w:hanging="317"/>
+      </w:pPr>
+      <w:r>
+        <w:t xml:space="preserve">5. A separately authorized publisher previews the content, enters a release note and chooses the relevant Publish action. Published assignments then appear in the authorized staff </w:t>
+      </w:r>
+      <w:r>
+        <w:rPr>
+          <w:b/>
+        </w:rPr>
+        <w:t>Distribution</w:t>
+      </w:r>
+      <w:r>
+        <w:t xml:space="preserve"> workspace. Publishing does not send assignments to students; an authorized distribution operator must release them separately.</w:t>
+      </w:r>
+    </w:p>
+    <w:p>
+      <w:r>
+        <w:t xml:space="preserve">Publishing a curriculum locks its topic material, not the separate assignment drafts. You can still use the Assignments tab to publish those drafts. </w:t>
+      </w:r>
+      <w:r>
+        <w:rPr>
+          <w:b/>
+        </w:rPr>
+        <w:t>Show all course assignments</w:t>
+      </w:r>
+      <w:r>
+        <w:t xml:space="preserve"> also lists drafts that were unlinked from a topic; use the explicit Link action to attach them to the selected topic before publication.</w:t>
+      </w:r>
+    </w:p>
+    <w:p>
+      <w:r>
+        <w:t>Named assignment references are available in the student assignment and teacher review screens through protected downloads. Content authoring does not grant access to other courses or to student-release operations.</w:t>
+      </w:r>
+    </w:p>
+    <w:p>
+      <w:pPr>
+        <w:pStyle w:val="Heading2"/>
+      </w:pPr>
+      <w:r>
+        <w:t>Review submitted work</w:t>
       </w:r>
     </w:p>
     <w:p>
@@ -2228,6 +2405,22 @@
       </w:pPr>
       <w:r>
         <w:t>5  Staff guide</w:t>
+      </w:r>
+    </w:p>
+    <w:p>
+      <w:r>
+        <w:t xml:space="preserve">Content tools are also available inside the Teacher portal for explicitly authorized course editors/publishers. Both entrances use the same drafts, named file references and publication rules. The </w:t>
+      </w:r>
+      <w:hyperlink r:id="rId12">
+        <w:r>
+          <w:rPr>
+            <w:color w:val="244B70"/>
+          </w:rPr>
+          <w:t>Teacher guide</w:t>
+        </w:r>
+      </w:hyperlink>
+      <w:r>
+        <w:t xml:space="preserve"> explains multiple attachments, descriptive names and confirmed draft-topic removal. Publication makes an assignment eligible for the authorized Distribution list; it does not release it to students automatically.</w:t>
       </w:r>
     </w:p>
     <w:p>

</xml_diff>

<commit_message>
F035: scoped teacher content and named attachments (#84)
* feat: add scoped teacher content tools and named references

* fix: keep named attachment controls readable in teacher layout

* test: enforce full-width named file layout

---------

Co-authored-by: jehar-tau <jehar-tau@users.noreply.github.com>
</commit_message>
<xml_diff>
--- a/docs/usage/downloads/Dexam-application-handbook.docx
+++ b/docs/usage/downloads/Dexam-application-handbook.docx
@@ -143,7 +143,7 @@
         </w:r>
       </w:hyperlink>
       <w:r>
-        <w:t>: reviewing submitted work, written/audio feedback, correction requests and assistance limits.</w:t>
+        <w:t>: scoped content authoring, named attachments, draft-topic removal, submission reviews and feedback.</w:t>
       </w:r>
     </w:p>
     <w:p>
@@ -318,18 +318,12 @@
         <w:t>/teacher</w:t>
       </w:r>
       <w:r>
-        <w:t xml:space="preserve">, </w:t>
-      </w:r>
-      <w:r>
-        <w:t>/teacher/reviews</w:t>
-      </w:r>
-      <w:r>
-        <w:t>, permitted notifications/security</w:t>
-      </w:r>
-    </w:p>
-    <w:p>
-      <w:r>
-        <w:t>Separate visual application?: Compact review rail</w:t>
+        <w:t>, authorized Reviews/Content, notifications/security</w:t>
+      </w:r>
+    </w:p>
+    <w:p>
+      <w:r>
+        <w:t>Separate visual application?: Compact teaching rail</w:t>
       </w:r>
     </w:p>
     <w:p>
@@ -718,7 +712,7 @@
     </w:p>
     <w:p>
       <w:r>
-        <w:t>Credentials / requirement: Established employee identity; current review scope checked on workspace entry</w:t>
+        <w:t>Credentials / requirement: Established employee identity; review scope or explicit same-course Teacher/content authority checked on entry</w:t>
       </w:r>
     </w:p>
     <w:p>
@@ -1316,6 +1310,20 @@
       </w:r>
     </w:p>
     <w:p>
+      <w:r>
+        <w:t xml:space="preserve">Assignments may include named reference files supplied by your teacher. Read the instructions, then use </w:t>
+      </w:r>
+      <w:r>
+        <w:rPr>
+          <w:b/>
+        </w:rPr>
+        <w:t>Assignment reference files</w:t>
+      </w:r>
+      <w:r>
+        <w:t xml:space="preserve"> to download each relevant reference. Names explain the file's purpose; these are separate from your own submission uploads. Downloads require current assignment access.</w:t>
+      </w:r>
+    </w:p>
+    <w:p>
       <w:pPr>
         <w:pStyle w:val="Heading2"/>
       </w:pPr>
@@ -1863,7 +1871,7 @@
         <w:t>/teacher</w:t>
       </w:r>
       <w:r>
-        <w:t>, with a review-focused layout. This is the same identity, not a new teacher account. Teacher access uses specifically assigned review authority - not automatic CRM, administration, content-editing, scheduling or full curriculum-reading access.</w:t>
+        <w:t>. This is the same identity, not a new teacher account. Review authority and content authoring/publication are separately scoped; Teacher alone grants neither content editing nor publishing, CRM, administration or scheduling.</w:t>
       </w:r>
     </w:p>
     <w:p>
@@ -1883,13 +1891,34 @@
         <w:t>/teacher/reviews</w:t>
       </w:r>
       <w:r>
-        <w:t xml:space="preserve">) from the teacher menu. Existing </w:t>
+        <w:t xml:space="preserve">) for assigned reviews or </w:t>
+      </w:r>
+      <w:r>
+        <w:rPr>
+          <w:b/>
+        </w:rPr>
+        <w:t>Content</w:t>
+      </w:r>
+      <w:r>
+        <w:t xml:space="preserve"> (</w:t>
+      </w:r>
+      <w:r>
+        <w:t>/teacher/content</w:t>
+      </w:r>
+      <w:r>
+        <w:t xml:space="preserve">) when explicitly authorized for academic authoring/publication. A scoped teacher author can enter without a review grant, but cannot use Reviews. Existing </w:t>
       </w:r>
       <w:r>
         <w:t>/staff/reviews</w:t>
       </w:r>
       <w:r>
-        <w:t xml:space="preserve"> bookmarks/notification links still work with the teacher layout and original guards. Without current review scope, the new teacher workspace is denied - not granted extra authority. Eligible portal-switch links change the workspace, not the signed-in person.</w:t>
+        <w:t xml:space="preserve"> and </w:t>
+      </w:r>
+      <w:r>
+        <w:t>/staff/content</w:t>
+      </w:r>
+      <w:r>
+        <w:t xml:space="preserve"> bookmarks retain their operation checks. Eligible portal-switch links change the workspace, not the signed-in person.</w:t>
       </w:r>
     </w:p>
     <w:p>
@@ -1902,7 +1931,155 @@
         <w:pStyle w:val="Heading2"/>
       </w:pPr>
       <w:r>
-        <w:t>Review a submission</w:t>
+        <w:t>Prepare topics and assignments</w:t>
+      </w:r>
+    </w:p>
+    <w:p>
+      <w:pPr>
+        <w:ind w:left="317" w:hanging="317"/>
+      </w:pPr>
+      <w:r>
+        <w:t xml:space="preserve">1. Open </w:t>
+      </w:r>
+      <w:r>
+        <w:rPr>
+          <w:b/>
+        </w:rPr>
+        <w:t>Content</w:t>
+      </w:r>
+      <w:r>
+        <w:t xml:space="preserve"> and choose your authorized </w:t>
+      </w:r>
+      <w:r>
+        <w:rPr>
+          <w:b/>
+        </w:rPr>
+        <w:t>Course offering</w:t>
+      </w:r>
+      <w:r>
+        <w:t>. Editing and publishing are separate permissions; a course assignment alone does not grant either.</w:t>
+      </w:r>
+    </w:p>
+    <w:p>
+      <w:pPr>
+        <w:ind w:left="317" w:hanging="317"/>
+      </w:pPr>
+      <w:r>
+        <w:t xml:space="preserve">2. Edit topic introductions and lesson instructions in a draft. Choose </w:t>
+      </w:r>
+      <w:r>
+        <w:rPr>
+          <w:b/>
+        </w:rPr>
+        <w:t>Attach lesson files</w:t>
+      </w:r>
+      <w:r>
+        <w:t xml:space="preserve"> to select several PDF/JPEG/PNG/WebP references. For topic-only references, choose </w:t>
+      </w:r>
+      <w:r>
+        <w:rPr>
+          <w:b/>
+        </w:rPr>
+        <w:t>Add topic attachments</w:t>
+      </w:r>
+      <w:r>
+        <w:t xml:space="preserve"> to prepare the topic's material lesson. Each lesson supports five files, 10 MB each.</w:t>
+      </w:r>
+    </w:p>
+    <w:p>
+      <w:pPr>
+        <w:ind w:left="317" w:hanging="317"/>
+      </w:pPr>
+      <w:r>
+        <w:t xml:space="preserve">3. Give each attached file a descriptive </w:t>
+      </w:r>
+      <w:r>
+        <w:rPr>
+          <w:b/>
+        </w:rPr>
+        <w:t>Attachment name</w:t>
+      </w:r>
+      <w:r>
+        <w:t xml:space="preserve">, then choose </w:t>
+      </w:r>
+      <w:r>
+        <w:rPr>
+          <w:b/>
+        </w:rPr>
+        <w:t>Save attachment name</w:t>
+      </w:r>
+      <w:r>
+        <w:t xml:space="preserve">. The original filename remains visible. In the Assignments tab, use </w:t>
+      </w:r>
+      <w:r>
+        <w:rPr>
+          <w:b/>
+        </w:rPr>
+        <w:t>Add private file</w:t>
+      </w:r>
+      <w:r>
+        <w:t xml:space="preserve"> for multiple assignment references under the same five-file/10 MB limits and name them individually.</w:t>
+      </w:r>
+    </w:p>
+    <w:p>
+      <w:pPr>
+        <w:ind w:left="317" w:hanging="317"/>
+      </w:pPr>
+      <w:r>
+        <w:t xml:space="preserve">4. To remove a draft topic, choose </w:t>
+      </w:r>
+      <w:r>
+        <w:rPr>
+          <w:b/>
+        </w:rPr>
+        <w:t>Preview topic removal</w:t>
+      </w:r>
+      <w:r>
+        <w:t>, inspect the affected lesson/file counts and linked assignments, then confirm. Explicitly unlink draft assignments first if appropriate; this preserves those assignment drafts. Published links block removal. Published topics cannot be deleted in place: create a new curriculum draft. Shared published files and earlier student versions remain protected.</w:t>
+      </w:r>
+    </w:p>
+    <w:p>
+      <w:pPr>
+        <w:ind w:left="317" w:hanging="317"/>
+      </w:pPr>
+      <w:r>
+        <w:t xml:space="preserve">5. A separately authorized publisher previews the content, enters a release note and chooses the relevant Publish action. Published assignments then appear in the authorized staff </w:t>
+      </w:r>
+      <w:r>
+        <w:rPr>
+          <w:b/>
+        </w:rPr>
+        <w:t>Distribution</w:t>
+      </w:r>
+      <w:r>
+        <w:t xml:space="preserve"> workspace. Publishing does not send assignments to students; an authorized distribution operator must release them separately.</w:t>
+      </w:r>
+    </w:p>
+    <w:p>
+      <w:r>
+        <w:t xml:space="preserve">Publishing a curriculum locks its topic material, not the separate assignment drafts. You can still use the Assignments tab to publish those drafts. </w:t>
+      </w:r>
+      <w:r>
+        <w:rPr>
+          <w:b/>
+        </w:rPr>
+        <w:t>Show all course assignments</w:t>
+      </w:r>
+      <w:r>
+        <w:t xml:space="preserve"> also lists drafts that were unlinked from a topic; use the explicit Link action to attach them to the selected topic before publication.</w:t>
+      </w:r>
+    </w:p>
+    <w:p>
+      <w:r>
+        <w:t>Named assignment references are available in the student assignment and teacher review screens through protected downloads. Content authoring does not grant access to other courses or to student-release operations.</w:t>
+      </w:r>
+    </w:p>
+    <w:p>
+      <w:pPr>
+        <w:pStyle w:val="Heading2"/>
+      </w:pPr>
+      <w:r>
+        <w:t>Review submitted work</w:t>
       </w:r>
     </w:p>
     <w:p>
@@ -2228,6 +2405,22 @@
       </w:pPr>
       <w:r>
         <w:t>5  Staff guide</w:t>
+      </w:r>
+    </w:p>
+    <w:p>
+      <w:r>
+        <w:t xml:space="preserve">Content tools are also available inside the Teacher portal for explicitly authorized course editors/publishers. Both entrances use the same drafts, named file references and publication rules. The </w:t>
+      </w:r>
+      <w:hyperlink r:id="rId12">
+        <w:r>
+          <w:rPr>
+            <w:color w:val="244B70"/>
+          </w:rPr>
+          <w:t>Teacher guide</w:t>
+        </w:r>
+      </w:hyperlink>
+      <w:r>
+        <w:t xml:space="preserve"> explains multiple attachments, descriptive names and confirmed draft-topic removal. Publication makes an assignment eligible for the authorized Distribution list; it does not release it to students automatically.</w:t>
       </w:r>
     </w:p>
     <w:p>

</xml_diff>